<commit_message>
Fix formatting in 02.14.docx: Adjusted spacing in the description for clarity
</commit_message>
<xml_diff>
--- a/work/02.14.docx
+++ b/work/02.14.docx
@@ -57,11 +57,13 @@
         </w:numPr>
         <w:rPr>
           <w:rFonts w:ascii="Arial" w:hAnsi="Arial" w:cs="Arial"/>
-        </w:rPr>
-      </w:pPr>
-      <w:r>
-        <w:rPr>
-          <w:rFonts w:ascii="Arial" w:hAnsi="Arial" w:cs="Arial"/>
+          <w:color w:val="808080" w:themeColor="background1" w:themeShade="80"/>
+        </w:rPr>
+      </w:pPr>
+      <w:r>
+        <w:rPr>
+          <w:rFonts w:ascii="Arial" w:hAnsi="Arial" w:cs="Arial"/>
+          <w:color w:val="808080" w:themeColor="background1" w:themeShade="80"/>
         </w:rPr>
         <w:t xml:space="preserve">Veure si </w:t>
       </w:r>
@@ -69,6 +71,7 @@
       <w:r>
         <w:rPr>
           <w:rFonts w:ascii="Arial" w:hAnsi="Arial" w:cs="Arial"/>
+          <w:color w:val="808080" w:themeColor="background1" w:themeShade="80"/>
         </w:rPr>
         <w:t>stop_sequence</w:t>
       </w:r>
@@ -76,6 +79,7 @@
       <w:r>
         <w:rPr>
           <w:rFonts w:ascii="Arial" w:hAnsi="Arial" w:cs="Arial"/>
+          <w:color w:val="808080" w:themeColor="background1" w:themeShade="80"/>
         </w:rPr>
         <w:t xml:space="preserve"> sempre incrementa d’1 en 1 pel mateix </w:t>
       </w:r>
@@ -83,10 +87,18 @@
       <w:r>
         <w:rPr>
           <w:rFonts w:ascii="Arial" w:hAnsi="Arial" w:cs="Arial"/>
+          <w:color w:val="808080" w:themeColor="background1" w:themeShade="80"/>
         </w:rPr>
         <w:t>trip_id</w:t>
       </w:r>
       <w:proofErr w:type="spellEnd"/>
+      <w:r>
+        <w:rPr>
+          <w:rFonts w:ascii="Arial" w:hAnsi="Arial" w:cs="Arial"/>
+          <w:color w:val="808080" w:themeColor="background1" w:themeShade="80"/>
+        </w:rPr>
+        <w:t xml:space="preserve"> </w:t>
+      </w:r>
     </w:p>
     <w:p>
       <w:pPr>
@@ -97,11 +109,13 @@
         </w:numPr>
         <w:rPr>
           <w:rFonts w:ascii="Arial" w:hAnsi="Arial" w:cs="Arial"/>
-        </w:rPr>
-      </w:pPr>
-      <w:r>
-        <w:rPr>
-          <w:rFonts w:ascii="Arial" w:hAnsi="Arial" w:cs="Arial"/>
+          <w:color w:val="808080" w:themeColor="background1" w:themeShade="80"/>
+        </w:rPr>
+      </w:pPr>
+      <w:r>
+        <w:rPr>
+          <w:rFonts w:ascii="Arial" w:hAnsi="Arial" w:cs="Arial"/>
+          <w:color w:val="808080" w:themeColor="background1" w:themeShade="80"/>
         </w:rPr>
         <w:t>Veure si hi ha trips repetits exactament iguals (les mateixes parades i mateixos temps)</w:t>
       </w:r>
@@ -115,11 +129,13 @@
         </w:numPr>
         <w:rPr>
           <w:rFonts w:ascii="Arial" w:hAnsi="Arial" w:cs="Arial"/>
-        </w:rPr>
-      </w:pPr>
-      <w:r>
-        <w:rPr>
-          <w:rFonts w:ascii="Arial" w:hAnsi="Arial" w:cs="Arial"/>
+          <w:color w:val="808080" w:themeColor="background1" w:themeShade="80"/>
+        </w:rPr>
+      </w:pPr>
+      <w:r>
+        <w:rPr>
+          <w:rFonts w:ascii="Arial" w:hAnsi="Arial" w:cs="Arial"/>
+          <w:color w:val="808080" w:themeColor="background1" w:themeShade="80"/>
         </w:rPr>
         <w:t xml:space="preserve">Fer </w:t>
       </w:r>
@@ -127,6 +143,7 @@
       <w:r>
         <w:rPr>
           <w:rFonts w:ascii="Arial" w:hAnsi="Arial" w:cs="Arial"/>
+          <w:color w:val="808080" w:themeColor="background1" w:themeShade="80"/>
         </w:rPr>
         <w:t>dict</w:t>
       </w:r>
@@ -134,6 +151,7 @@
       <w:r>
         <w:rPr>
           <w:rFonts w:ascii="Arial" w:hAnsi="Arial" w:cs="Arial"/>
+          <w:color w:val="808080" w:themeColor="background1" w:themeShade="80"/>
         </w:rPr>
         <w:t>[</w:t>
       </w:r>
@@ -141,6 +159,7 @@
       <w:r>
         <w:rPr>
           <w:rFonts w:ascii="Arial" w:hAnsi="Arial" w:cs="Arial"/>
+          <w:color w:val="808080" w:themeColor="background1" w:themeShade="80"/>
         </w:rPr>
         <w:t>route_id</w:t>
       </w:r>
@@ -148,6 +167,7 @@
       <w:r>
         <w:rPr>
           <w:rFonts w:ascii="Arial" w:hAnsi="Arial" w:cs="Arial"/>
+          <w:color w:val="808080" w:themeColor="background1" w:themeShade="80"/>
         </w:rPr>
         <w:t>]=set[</w:t>
       </w:r>
@@ -155,6 +175,7 @@
       <w:r>
         <w:rPr>
           <w:rFonts w:ascii="Arial" w:hAnsi="Arial" w:cs="Arial"/>
+          <w:color w:val="808080" w:themeColor="background1" w:themeShade="80"/>
         </w:rPr>
         <w:t>trip_id</w:t>
       </w:r>
@@ -162,6 +183,7 @@
       <w:r>
         <w:rPr>
           <w:rFonts w:ascii="Arial" w:hAnsi="Arial" w:cs="Arial"/>
+          <w:color w:val="808080" w:themeColor="background1" w:themeShade="80"/>
         </w:rPr>
         <w:t>]</w:t>
       </w:r>

</xml_diff>